<commit_message>
eurosteklo-ee2: TZ: Eurosteklo 1C developer question pack (atom eurosteklo-xeb, claude-7934)
ТЗ: /root/workspaces/projects/clients/eurosteklo/.worktrees/claude/eurosteklo-ee2/docs/tz/2026-10-15-1c-questions.md#U5
Atom: eurosteklo-ee2
Agent: claude
</commit_message>
<xml_diff>
--- a/docs/meetings/2026-10-15-1c-call/1c-rabochiy-list-dmitriy.docx
+++ b/docs/meetings/2026-10-15-1c-call/1c-rabochiy-list-dmitriy.docx
@@ -2,157 +2,80 @@
 <file path=word/document.xml><?xml version="1.0" encoding="utf-8"?>
 <w:document xmlns:w="http://schemas.openxmlformats.org/wordprocessingml/2006/main" xmlns:m="http://schemas.openxmlformats.org/officeDocument/2006/math" xmlns:r="http://schemas.openxmlformats.org/officeDocument/2006/relationships" xmlns:o="urn:schemas-microsoft-com:office:office" xmlns:v="urn:schemas-microsoft-com:vml" xmlns:w10="urn:schemas-microsoft-com:office:word" xmlns:a="http://schemas.openxmlformats.org/drawingml/2006/main" xmlns:pic="http://schemas.openxmlformats.org/drawingml/2006/picture" xmlns:wp="http://schemas.openxmlformats.org/drawingml/2006/wordprocessingDrawing">
   <w:body>
-    <w:bookmarkStart w:id="32" w:name="Xb0739b06fbf4f2a734915020600b375933d7e05"/>
+    <w:bookmarkStart w:id="23" w:name="евро-стекло-справка-для-дмитрия"/>
     <w:p>
       <w:pPr>
         <w:pStyle w:val="Heading1"/>
       </w:pPr>
       <w:r>
-        <w:t xml:space="preserve">Евро стекло — рабочий лист для Дмитрия (1С-разработчик)</w:t>
-      </w:r>
-    </w:p>
-    <w:p>
-      <w:pPr>
-        <w:pStyle w:val="FirstParagraph"/>
-      </w:pPr>
-      <w:r>
-        <w:t xml:space="preserve">Ответьте прямо под каждым вопросом в поле ответа; при необходимости процитируйте вопрос.</w:t>
-      </w:r>
-    </w:p>
-    <w:bookmarkStart w:id="20" w:name="кому"/>
+        <w:t xml:space="preserve">Евро стекло — справка для Дмитрия</w:t>
+      </w:r>
+    </w:p>
+    <w:bookmarkStart w:id="20" w:name="кто-есть-кто"/>
     <w:p>
       <w:pPr>
         <w:pStyle w:val="Heading2"/>
       </w:pPr>
       <w:r>
-        <w:t xml:space="preserve">Кому</w:t>
-      </w:r>
-    </w:p>
-    <w:p>
-      <w:pPr>
-        <w:pStyle w:val="FirstParagraph"/>
-      </w:pPr>
-      <w:r>
-        <w:t xml:space="preserve">Дмитрию, 1С-разработчику интегратора. От Андрея. Дата: 15 октября 2026.</w:t>
+        <w:t xml:space="preserve">Кто есть кто</w:t>
+      </w:r>
+    </w:p>
+    <w:p>
+      <w:pPr>
+        <w:numPr>
+          <w:ilvl w:val="0"/>
+          <w:numId w:val="1001"/>
+        </w:numPr>
+        <w:pStyle w:val="Compact"/>
+      </w:pPr>
+      <w:r>
+        <w:t xml:space="preserve">Роман — директор клиента «Евро стекло», на встрече показал и объяснил, как в 1С идёт работа.</w:t>
+      </w:r>
+    </w:p>
+    <w:p>
+      <w:pPr>
+        <w:numPr>
+          <w:ilvl w:val="0"/>
+          <w:numId w:val="1001"/>
+        </w:numPr>
+        <w:pStyle w:val="Compact"/>
+      </w:pPr>
+      <w:r>
+        <w:t xml:space="preserve">Виталий — 1С-разработчик клиента.</w:t>
+      </w:r>
+    </w:p>
+    <w:p>
+      <w:pPr>
+        <w:numPr>
+          <w:ilvl w:val="0"/>
+          <w:numId w:val="1001"/>
+        </w:numPr>
+        <w:pStyle w:val="Compact"/>
+      </w:pPr>
+      <w:r>
+        <w:t xml:space="preserve">Андрей — руководитель интегратора ARWOX.</w:t>
+      </w:r>
+    </w:p>
+    <w:p>
+      <w:pPr>
+        <w:numPr>
+          <w:ilvl w:val="0"/>
+          <w:numId w:val="1001"/>
+        </w:numPr>
+        <w:pStyle w:val="Compact"/>
+      </w:pPr>
+      <w:r>
+        <w:t xml:space="preserve">Дмитрий — 1С-разработчик ARWOX, новый на проекте.</w:t>
       </w:r>
     </w:p>
     <w:bookmarkEnd w:id="20"/>
-    <w:bookmarkStart w:id="21" w:name="цель"/>
+    <w:bookmarkStart w:id="21" w:name="что-показал-роман"/>
     <w:p>
       <w:pPr>
         <w:pStyle w:val="Heading2"/>
       </w:pPr>
       <w:r>
-        <w:t xml:space="preserve">Цель</w:t>
-      </w:r>
-    </w:p>
-    <w:p>
-      <w:pPr>
-        <w:pStyle w:val="FirstParagraph"/>
-      </w:pPr>
-      <w:r>
-        <w:t xml:space="preserve">Ваши 8 вопросов к клиенту, расширенные: у каждого есть цель и перечень того, что описать или прислать. Адресат вопросов — Виталий, 1С-разработчик со стороны «Евро стекло». Когда Виталий ответит, мы разберём сравнение конфигураций, расширения, механизм обмена и ошибки, после чего оценим объём работ.</w:t>
-      </w:r>
-    </w:p>
-    <w:bookmarkEnd w:id="21"/>
-    <w:bookmarkStart w:id="22" w:name="заметки-для-подготовки"/>
-    <w:p>
-      <w:pPr>
-        <w:pStyle w:val="Heading2"/>
-      </w:pPr>
-      <w:r>
-        <w:t xml:space="preserve">Заметки для подготовки</w:t>
-      </w:r>
-    </w:p>
-    <w:p>
-      <w:pPr>
-        <w:numPr>
-          <w:ilvl w:val="0"/>
-          <w:numId w:val="1001"/>
-        </w:numPr>
-        <w:pStyle w:val="Compact"/>
-      </w:pPr>
-      <w:r>
-        <w:t xml:space="preserve">Интеграцию Битрикс24 и 1С сделали в 2025 году, настраивал её прежний 1С-разработчик, а не Виталий. Поэтому про механизм обмена лучше спрашивать так: какой учётной записью и каким способом 1С передаёт данные в Битрикс24.</w:t>
-      </w:r>
-    </w:p>
-    <w:p>
-      <w:pPr>
-        <w:numPr>
-          <w:ilvl w:val="0"/>
-          <w:numId w:val="1001"/>
-        </w:numPr>
-        <w:pStyle w:val="Compact"/>
-      </w:pPr>
-      <w:r>
-        <w:t xml:space="preserve">Имя пользователя-бота на портале Битрикс24 и настройки коннектора со статусами должны дать Андрей или Роман: Виталий может этого не знать.</w:t>
-      </w:r>
-    </w:p>
-    <w:p>
-      <w:pPr>
-        <w:numPr>
-          <w:ilvl w:val="0"/>
-          <w:numId w:val="1001"/>
-        </w:numPr>
-        <w:pStyle w:val="Compact"/>
-      </w:pPr>
-      <w:r>
-        <w:t xml:space="preserve">Роман говорил о недавнем сбое: у одного менеджера пропала учётная запись, его заказы оказались на Романе, а ранее распределённые заказы вернулись к нему. Причина не названа.</w:t>
-      </w:r>
-    </w:p>
-    <w:p>
-      <w:pPr>
-        <w:numPr>
-          <w:ilvl w:val="0"/>
-          <w:numId w:val="1001"/>
-        </w:numPr>
-        <w:pStyle w:val="Compact"/>
-      </w:pPr>
-      <w:r>
-        <w:t xml:space="preserve">Цель каждого вопроса стоит объяснить Виталию словами: без понимания, что мы хотим получить, ему трудно отвечать.</w:t>
-      </w:r>
-    </w:p>
-    <w:p>
-      <w:pPr>
-        <w:numPr>
-          <w:ilvl w:val="0"/>
-          <w:numId w:val="1001"/>
-        </w:numPr>
-        <w:pStyle w:val="Compact"/>
-      </w:pPr>
-      <w:r>
-        <w:t xml:space="preserve">Печатные формы, статусы и обмен с принтером отдела ПТО упоминались в разговоре, но в ваши 8 вопросов не входят. Не расширяйте объём без согласования.</w:t>
-      </w:r>
-    </w:p>
-    <w:p>
-      <w:pPr>
-        <w:numPr>
-          <w:ilvl w:val="0"/>
-          <w:numId w:val="1001"/>
-        </w:numPr>
-        <w:pStyle w:val="Compact"/>
-      </w:pPr>
-      <w:r>
-        <w:t xml:space="preserve">Полное техническое задание сейчас не готовится; цена и доступ к копии базы обсуждаются позже.</w:t>
-      </w:r>
-    </w:p>
-    <w:bookmarkEnd w:id="22"/>
-    <w:bookmarkStart w:id="31" w:name="вопросы"/>
-    <w:p>
-      <w:pPr>
-        <w:pStyle w:val="Heading2"/>
-      </w:pPr>
-      <w:r>
-        <w:t xml:space="preserve">Вопросы</w:t>
-      </w:r>
-    </w:p>
-    <w:bookmarkStart w:id="23" w:name="Xafe92ae6bc770ae2e71362b0ca59fe8866d18c2"/>
-    <w:p>
-      <w:pPr>
-        <w:pStyle w:val="Heading3"/>
-      </w:pPr>
-      <w:r>
-        <w:t xml:space="preserve">1. Сравнение рабочей конфигурации с конфигурацией поставщика</w:t>
+        <w:t xml:space="preserve">Что показал Роман</w:t>
       </w:r>
     </w:p>
     <w:p>
@@ -164,13 +87,13 @@
           <w:bCs/>
           <w:b/>
         </w:rPr>
-        <w:t xml:space="preserve">Вопрос:</w:t>
+        <w:t xml:space="preserve">Цель.</w:t>
       </w:r>
       <w:r>
         <w:t xml:space="preserve"> </w:t>
       </w:r>
       <w:r>
-        <w:t xml:space="preserve">Виталий, сделайте сравнение рабочей конфигурации с конфигурацией поставщика и пришлите полный отчёт о расхождениях. Зачем: отделить типовой функционал от доработок прежнего разработчика, от этого зависят объём и стоимость корректировки.</w:t>
+        <w:t xml:space="preserve">Нужна интеграция Битрикс24 с 1С: номенклатура, контрагенты, заказы, договоры, счета и печатные формы. Главная система — 1С как учётная. Документы приходят в Битрикс24 в виде PDF для просмотра и отправки клиенту, правятся только в 1С. Интеграция 2025 года уже есть: событие и данные заказа в Битрикс24 создаются, разнос платежей отображается. Прежний 1С-разработчик, по словам Андрея, неверно понял процесс, поэтому нужна точечная корректировка. Старое ТЗ есть, сейчас собираются требования для обновлённого.</w:t>
       </w:r>
     </w:p>
     <w:p>
@@ -182,13 +105,13 @@
           <w:bCs/>
           <w:b/>
         </w:rPr>
-        <w:t xml:space="preserve">Что описать или прислать:</w:t>
+        <w:t xml:space="preserve">Как создаётся заказ.</w:t>
       </w:r>
       <w:r>
         <w:t xml:space="preserve"> </w:t>
       </w:r>
       <w:r>
-        <w:t xml:space="preserve">отчёт о сравнении (текст или таблица): изменённые, добавленные и удалённые объекты, модули, формы, макеты, роли; режим поддержки и список объектов, снятых с поддержки. Укажите, где это находится в вашей базе.</w:t>
+        <w:t xml:space="preserve">Продажи, заказы клиентов, создать. Клиент выбирается из списка или заводится новым. Указываются контрагент, соглашение, место отгрузки, цех, склад, организация, вид заказа (закалка, мебель, проекты и другие, это типы клиентов), дата отгрузки. Для запуска ставится галочка «Запустить в производство». Есть поле «Состояние» заказа, оно соответствует этапам сделки. Роман сказал, что состояния сейчас отображены не так, как нужно в Битрикс24.</w:t>
       </w:r>
     </w:p>
     <w:p>
@@ -200,43 +123,31 @@
           <w:bCs/>
           <w:b/>
         </w:rPr>
-        <w:t xml:space="preserve">Ответ:</w:t>
+        <w:t xml:space="preserve">Товары и цены.</w:t>
+      </w:r>
+      <w:r>
+        <w:t xml:space="preserve"> </w:t>
+      </w:r>
+      <w:r>
+        <w:t xml:space="preserve">На вкладке «Товары» добавляется номенклатура с размерами и количеством. Верхняя часть печатается для клиента. Нижняя часть для внутреннего использования: материал, нарезка, мойка, упаковка, фацет по периметру. Тип расчёта: по площади, по количеству, по периметру. Цены обычно подтягиваются сами, вручную их не вносят (кроме непредвиденных расходов). Скидки регулируются двумя полями: вид цены и коэффициент сложности (например 0,5, 0,8, 1,3, 1,8). Остальное считается автоматически.</w:t>
       </w:r>
     </w:p>
     <w:p>
       <w:pPr>
         <w:pStyle w:val="BodyText"/>
-      </w:pPr>
-      <w:r>
-        <w:t xml:space="preserve"> </w:t>
-      </w:r>
-    </w:p>
-    <w:bookmarkEnd w:id="23"/>
-    <w:bookmarkStart w:id="24" w:name="расширения-конфигурации-не-от-фирмы-1с"/>
-    <w:p>
-      <w:pPr>
-        <w:pStyle w:val="Heading3"/>
-      </w:pPr>
-      <w:r>
-        <w:t xml:space="preserve">2. Расширения конфигурации не от фирмы 1С</w:t>
-      </w:r>
-    </w:p>
-    <w:p>
-      <w:pPr>
-        <w:pStyle w:val="FirstParagraph"/>
       </w:pPr>
       <w:r>
         <w:rPr>
           <w:bCs/>
           <w:b/>
         </w:rPr>
-        <w:t xml:space="preserve">Вопрос:</w:t>
+        <w:t xml:space="preserve">Прочие поля заказа.</w:t>
       </w:r>
       <w:r>
         <w:t xml:space="preserve"> </w:t>
       </w:r>
       <w:r>
-        <w:t xml:space="preserve">Какие расширения конфигурации установлены не фирмой 1С и что каждое из них добавляет или меняет? Зачем: понять, не лежит ли интеграция с Битрикс24 в расширении и какие расширения нельзя трогать.</w:t>
+        <w:t xml:space="preserve">Менеджер, подразделение, группа финансового учёта (расчёты с покупателями, с мебельщиками, со строителями), статья ДДС, НДС. Договор подтягивается, если у контрагента он уже есть. К заказу прикрепляются файлы: для запуска в производство обязательны чертёж DXF (идёт на станок) и чертёж PDF. Также прикрепляются спецификации на монтаж и фурнитуру.</w:t>
       </w:r>
     </w:p>
     <w:p>
@@ -248,13 +159,13 @@
           <w:bCs/>
           <w:b/>
         </w:rPr>
-        <w:t xml:space="preserve">Что описать или прислать:</w:t>
+        <w:t xml:space="preserve">Сбой при показе.</w:t>
       </w:r>
       <w:r>
         <w:t xml:space="preserve"> </w:t>
       </w:r>
       <w:r>
-        <w:t xml:space="preserve">для каждого расширения: имя, версия, автор, дата, активно или нет, режим безопасности; список добавленных или изменённых объектов (справочники, документы, регистры, обработки, подписки на события, HTTP-сервисы); по возможности выгрузка самих расширений. Укажите, где это находится в вашей базе.</w:t>
+        <w:t xml:space="preserve">При показе цены в новых заказах не подтянулись. Роман назвал причиной недавний сбой (по его словам, где-то «разбомбили серверы», Дмитрий уточнил про Яндекс, Роман согласился) и сказал, что разберутся.</w:t>
       </w:r>
     </w:p>
     <w:p>
@@ -266,43 +177,31 @@
           <w:bCs/>
           <w:b/>
         </w:rPr>
-        <w:t xml:space="preserve">Ответ:</w:t>
+        <w:t xml:space="preserve">Документы.</w:t>
+      </w:r>
+      <w:r>
+        <w:t xml:space="preserve"> </w:t>
+      </w:r>
+      <w:r>
+        <w:t xml:space="preserve">Печатные формы формируются через «Печать», сохраняются в любом формате или отправляются. Заказ на производство можно отправить сразу на принтер руководителя планово-технического отдела. Счёт на оплату и реализация создаются на основании заказа. Реализация и УПД оформляются в конце, иногда с товарной накладной. Клиенту их отправляют через ЭДО, лично или подписывают при самовывозе. Из 1С документы можно отправить и почтой, и в ЭДО (по словам Виталия). Андрей спросил, как часто печатные формы меняют после отправки. Виталий ответил, что изменения в заказы и реализации вносятся. Дмитрий ответил, что механизм «форма изменилась» сделать можно, но сравнение сложное.</w:t>
       </w:r>
     </w:p>
     <w:p>
       <w:pPr>
         <w:pStyle w:val="BodyText"/>
-      </w:pPr>
-      <w:r>
-        <w:t xml:space="preserve"> </w:t>
-      </w:r>
-    </w:p>
-    <w:bookmarkEnd w:id="24"/>
-    <w:bookmarkStart w:id="25" w:name="механизм-связи-1с-с-битрикс24"/>
-    <w:p>
-      <w:pPr>
-        <w:pStyle w:val="Heading3"/>
-      </w:pPr>
-      <w:r>
-        <w:t xml:space="preserve">3. Механизм связи 1С с Битрикс24</w:t>
-      </w:r>
-    </w:p>
-    <w:p>
-      <w:pPr>
-        <w:pStyle w:val="FirstParagraph"/>
       </w:pPr>
       <w:r>
         <w:rPr>
           <w:bCs/>
           <w:b/>
         </w:rPr>
-        <w:t xml:space="preserve">Вопрос:</w:t>
+        <w:t xml:space="preserve">Задания и календарь.</w:t>
       </w:r>
       <w:r>
         <w:t xml:space="preserve"> </w:t>
       </w:r>
       <w:r>
-        <w:t xml:space="preserve">Какой бот или механизм связывает 1С с Битрикс24 и что именно он делает? Зачем: понять, что сейчас автоматизировано и что придётся сохранить, переделать или отключить.</w:t>
+        <w:t xml:space="preserve">Из заказа создаётся задание (замер, монтаж, рекламация, доставка) с исполнителем, сроком и файлами. Задания отображаются в календаре 1С. Рекламации в интеграцию пока не входят. Синхронизация календаря желательна, но не обязательна. Если заказы ведутся в Битрикс24, календарём 1С перестанут пользоваться.</w:t>
       </w:r>
     </w:p>
     <w:p>
@@ -314,13 +213,13 @@
           <w:bCs/>
           <w:b/>
         </w:rPr>
-        <w:t xml:space="preserve">Что описать или прислать:</w:t>
+        <w:t xml:space="preserve">Цикл заказа.</w:t>
       </w:r>
       <w:r>
         <w:t xml:space="preserve"> </w:t>
       </w:r>
       <w:r>
-        <w:t xml:space="preserve">язык и платформа, где механизм работает (в 1С или на отдельном сервере), есть ли исходники и документация, под какой учётной записью он пишет в Битрикс24 и какие действия выполняет (без пароля). Укажите, где это находится в вашей базе и на ваших серверах.</w:t>
+        <w:t xml:space="preserve">Счёт клиенту, затем оплата. Роман показал отчёт по оплатам за период: от кого, сумма, назначение платежа. Если в счёте и назначении платежа указан номер заказа, оплата привязывается к заказу сама. Состояния и разнос оплат сейчас меняются вручную. Предоплата, затем заказ запускается в производство (галочка, файлы, заказ на производство через печать). Руководитель планово-технического отдела ставит «В производстве», позже «Изготовлено». Менеджер видит это подсветкой в журнале заказов и связывается с клиентом. Затем второй счёт на доплату, оплата остатка, реализация и закрывающие документы. К заказу привязаны все документы: оплаты, заказы на внутреннее потребление (клей, лента и др.), заказы на производство (по одному на каждое изделие).</w:t>
       </w:r>
     </w:p>
     <w:p>
@@ -332,43 +231,31 @@
           <w:bCs/>
           <w:b/>
         </w:rPr>
-        <w:t xml:space="preserve">Ответ:</w:t>
+        <w:t xml:space="preserve">Состояния.</w:t>
+      </w:r>
+      <w:r>
+        <w:t xml:space="preserve"> </w:t>
+      </w:r>
+      <w:r>
+        <w:t xml:space="preserve">Нынешний набор состояний в 1С не утверждён: лишние есть, часть не выбирается. Роман сказал, что их поменяют, и названия будут такими же, как этапы в Битрикс24 (на доске Miro лишних нет). Андрей предупредил, что изменение набора после реализации удорожит проект.</w:t>
       </w:r>
     </w:p>
     <w:p>
       <w:pPr>
         <w:pStyle w:val="BodyText"/>
-      </w:pPr>
-      <w:r>
-        <w:t xml:space="preserve"> </w:t>
-      </w:r>
-    </w:p>
-    <w:bookmarkEnd w:id="25"/>
-    <w:bookmarkStart w:id="26" w:name="как-устроен-обмен-между-битрикс24-и-1с"/>
-    <w:p>
-      <w:pPr>
-        <w:pStyle w:val="Heading3"/>
-      </w:pPr>
-      <w:r>
-        <w:t xml:space="preserve">4. Как устроен обмен между Битрикс24 и 1С</w:t>
-      </w:r>
-    </w:p>
-    <w:p>
-      <w:pPr>
-        <w:pStyle w:val="FirstParagraph"/>
       </w:pPr>
       <w:r>
         <w:rPr>
           <w:bCs/>
           <w:b/>
         </w:rPr>
-        <w:t xml:space="preserve">Вопрос:</w:t>
+        <w:t xml:space="preserve">Пользователи.</w:t>
       </w:r>
       <w:r>
         <w:t xml:space="preserve"> </w:t>
       </w:r>
       <w:r>
-        <w:t xml:space="preserve">Как технически реализован обмен: план обмена, расширение, внешняя обработка, HTTP-сервис, прямые запросы к Битрикс24 или что-то другое? Зачем: решить, развивать существующий обмен или строить новый, и оценить риск потери данных.</w:t>
+        <w:t xml:space="preserve">Битрикс24 сейчас используется только как мессенджер. Основная программа пока 1С. Ею пользуются отдел продаж, администрация отделов, планово-технический отдел и руководители производства. Рядовые рабочие без станка доступа не имеют.</w:t>
       </w:r>
     </w:p>
     <w:p>
@@ -380,13 +267,13 @@
           <w:bCs/>
           <w:b/>
         </w:rPr>
-        <w:t xml:space="preserve">Что описать или прислать:</w:t>
+        <w:t xml:space="preserve">Сбой с заказами.</w:t>
       </w:r>
       <w:r>
         <w:t xml:space="preserve"> </w:t>
       </w:r>
       <w:r>
-        <w:t xml:space="preserve">схема обмена хотя бы словами; список объектов и направление данных по каждому; как сопоставляются записи 1С и Битрикс24; что происходит при ошибке и при повторе. Укажите, где это находится в вашей базе.</w:t>
+        <w:t xml:space="preserve">После последних сбоев один менеджер исчез из системы, и его заказы повисли на Романе. Заказы, ранее распределённые по менеджерам, вернулись к Роману, как будто работа откатилась на пару месяцев. Прежде на старте проблемы были с дублями заказов, нумерацией, неверно заведёнными контактами и номерами. Роман сказал, что у клиента есть почти штатные специалисты, и найденные проблемы они решат оперативно. Андрей отметил, что интегрировать некорректно работающую главную систему нельзя.</w:t>
       </w:r>
     </w:p>
     <w:p>
@@ -398,25 +285,23 @@
           <w:bCs/>
           <w:b/>
         </w:rPr>
-        <w:t xml:space="preserve">Ответ:</w:t>
-      </w:r>
-    </w:p>
-    <w:p>
-      <w:pPr>
-        <w:pStyle w:val="BodyText"/>
-      </w:pPr>
-      <w:r>
-        <w:t xml:space="preserve"> </w:t>
-      </w:r>
-    </w:p>
-    <w:bookmarkEnd w:id="26"/>
-    <w:bookmarkStart w:id="27" w:name="частота-обмена"/>
-    <w:p>
-      <w:pPr>
-        <w:pStyle w:val="Heading3"/>
-      </w:pPr>
-      <w:r>
-        <w:t xml:space="preserve">5. Частота обмена</w:t>
+        <w:t xml:space="preserve">Доступ.</w:t>
+      </w:r>
+      <w:r>
+        <w:t xml:space="preserve"> </w:t>
+      </w:r>
+      <w:r>
+        <w:t xml:space="preserve">Копию базы клиент предоставит после подписания документа. Андрей пришлёт Виталию последнюю версию ТЗ.</w:t>
+      </w:r>
+    </w:p>
+    <w:bookmarkEnd w:id="21"/>
+    <w:bookmarkStart w:id="22" w:name="какие-вопросы-ушли"/>
+    <w:p>
+      <w:pPr>
+        <w:pStyle w:val="Heading2"/>
+      </w:pPr>
+      <w:r>
+        <w:t xml:space="preserve">Какие вопросы ушли</w:t>
       </w:r>
     </w:p>
     <w:p>
@@ -428,254 +313,311 @@
           <w:bCs/>
           <w:b/>
         </w:rPr>
-        <w:t xml:space="preserve">Вопрос:</w:t>
+        <w:t xml:space="preserve">Виталию — об устройстве 1С</w:t>
       </w:r>
       <w:r>
         <w:t xml:space="preserve"> </w:t>
       </w:r>
       <w:r>
-        <w:t xml:space="preserve">Как часто запускается обмен между 1С и Битрикс24: по расписанию, по записи документа или вручную? Зачем: оценить задержку статусов в Битрикс24 и нагрузку на базу, выбрать режим новой интеграции.</w:t>
-      </w:r>
-    </w:p>
-    <w:p>
-      <w:pPr>
-        <w:pStyle w:val="BodyText"/>
+        <w:t xml:space="preserve">(16 тем). Важно, чтобы понять, как база устроена технически и как работает уже существующий обмен с Битрикс24.</w:t>
+      </w:r>
+    </w:p>
+    <w:p>
+      <w:pPr>
+        <w:numPr>
+          <w:ilvl w:val="0"/>
+          <w:numId w:val="1002"/>
+        </w:numPr>
+        <w:pStyle w:val="Compact"/>
+      </w:pPr>
+      <w:r>
+        <w:t xml:space="preserve">Сравнение конфигурации с конфигурацией поставщика</w:t>
+      </w:r>
+    </w:p>
+    <w:p>
+      <w:pPr>
+        <w:numPr>
+          <w:ilvl w:val="0"/>
+          <w:numId w:val="1002"/>
+        </w:numPr>
+        <w:pStyle w:val="Compact"/>
+      </w:pPr>
+      <w:r>
+        <w:t xml:space="preserve">Расширения не от фирмы 1С</w:t>
+      </w:r>
+    </w:p>
+    <w:p>
+      <w:pPr>
+        <w:numPr>
+          <w:ilvl w:val="0"/>
+          <w:numId w:val="1002"/>
+        </w:numPr>
+        <w:pStyle w:val="Compact"/>
+      </w:pPr>
+      <w:r>
+        <w:t xml:space="preserve">Бот и механизм интеграции с Битрикс24</w:t>
+      </w:r>
+    </w:p>
+    <w:p>
+      <w:pPr>
+        <w:numPr>
+          <w:ilvl w:val="0"/>
+          <w:numId w:val="1002"/>
+        </w:numPr>
+        <w:pStyle w:val="Compact"/>
+      </w:pPr>
+      <w:r>
+        <w:t xml:space="preserve">Как устроен обмен с Битрикс24</w:t>
+      </w:r>
+    </w:p>
+    <w:p>
+      <w:pPr>
+        <w:numPr>
+          <w:ilvl w:val="0"/>
+          <w:numId w:val="1002"/>
+        </w:numPr>
+        <w:pStyle w:val="Compact"/>
+      </w:pPr>
+      <w:r>
+        <w:t xml:space="preserve">Частота обмена</w:t>
+      </w:r>
+    </w:p>
+    <w:p>
+      <w:pPr>
+        <w:numPr>
+          <w:ilvl w:val="0"/>
+          <w:numId w:val="1002"/>
+        </w:numPr>
+        <w:pStyle w:val="Compact"/>
+      </w:pPr>
+      <w:r>
+        <w:t xml:space="preserve">Другие настроенные обмены</w:t>
+      </w:r>
+    </w:p>
+    <w:p>
+      <w:pPr>
+        <w:numPr>
+          <w:ilvl w:val="0"/>
+          <w:numId w:val="1002"/>
+        </w:numPr>
+        <w:pStyle w:val="Compact"/>
+      </w:pPr>
+      <w:r>
+        <w:t xml:space="preserve">Конфигурация, редакция и версия</w:t>
+      </w:r>
+    </w:p>
+    <w:p>
+      <w:pPr>
+        <w:numPr>
+          <w:ilvl w:val="0"/>
+          <w:numId w:val="1002"/>
+        </w:numPr>
+        <w:pStyle w:val="Compact"/>
+      </w:pPr>
+      <w:r>
+        <w:t xml:space="preserve">Кто и как вносит изменения в 1С сейчас</w:t>
+      </w:r>
+    </w:p>
+    <w:p>
+      <w:pPr>
+        <w:numPr>
+          <w:ilvl w:val="0"/>
+          <w:numId w:val="1002"/>
+        </w:numPr>
+        <w:pStyle w:val="Compact"/>
+      </w:pPr>
+      <w:r>
+        <w:t xml:space="preserve">Пользователь 1С для интеграции и его права</w:t>
+      </w:r>
+    </w:p>
+    <w:p>
+      <w:pPr>
+        <w:numPr>
+          <w:ilvl w:val="0"/>
+          <w:numId w:val="1002"/>
+        </w:numPr>
+        <w:pStyle w:val="Compact"/>
+      </w:pPr>
+      <w:r>
+        <w:t xml:space="preserve">Где размещена база и как к ней обращаться извне</w:t>
+      </w:r>
+    </w:p>
+    <w:p>
+      <w:pPr>
+        <w:numPr>
+          <w:ilvl w:val="0"/>
+          <w:numId w:val="1002"/>
+        </w:numPr>
+        <w:pStyle w:val="Compact"/>
+      </w:pPr>
+      <w:r>
+        <w:t xml:space="preserve">Регламентные и фоновые задания</w:t>
+      </w:r>
+    </w:p>
+    <w:p>
+      <w:pPr>
+        <w:numPr>
+          <w:ilvl w:val="0"/>
+          <w:numId w:val="1002"/>
+        </w:numPr>
+        <w:pStyle w:val="Compact"/>
+      </w:pPr>
+      <w:r>
+        <w:t xml:space="preserve">Журнал обмена и ошибок</w:t>
+      </w:r>
+    </w:p>
+    <w:p>
+      <w:pPr>
+        <w:numPr>
+          <w:ilvl w:val="0"/>
+          <w:numId w:val="1002"/>
+        </w:numPr>
+        <w:pStyle w:val="Compact"/>
+      </w:pPr>
+      <w:r>
+        <w:t xml:space="preserve">Печатные формы и документы для передачи в Битрикс24</w:t>
+      </w:r>
+    </w:p>
+    <w:p>
+      <w:pPr>
+        <w:numPr>
+          <w:ilvl w:val="0"/>
+          <w:numId w:val="1002"/>
+        </w:numPr>
+        <w:pStyle w:val="Compact"/>
+      </w:pPr>
+      <w:r>
+        <w:t xml:space="preserve">Дубли заказов и контрагентов, нумерация</w:t>
+      </w:r>
+    </w:p>
+    <w:p>
+      <w:pPr>
+        <w:numPr>
+          <w:ilvl w:val="0"/>
+          <w:numId w:val="1002"/>
+        </w:numPr>
+        <w:pStyle w:val="Compact"/>
+      </w:pPr>
+      <w:r>
+        <w:t xml:space="preserve">Номенклатура, контрагенты и ключи сопоставления</w:t>
+      </w:r>
+    </w:p>
+    <w:p>
+      <w:pPr>
+        <w:numPr>
+          <w:ilvl w:val="0"/>
+          <w:numId w:val="1002"/>
+        </w:numPr>
+        <w:pStyle w:val="Compact"/>
+      </w:pPr>
+      <w:r>
+        <w:t xml:space="preserve">Тестовая копия базы и доступ для ARWOX</w:t>
+      </w:r>
+    </w:p>
+    <w:p>
+      <w:pPr>
+        <w:pStyle w:val="FirstParagraph"/>
       </w:pPr>
       <w:r>
         <w:rPr>
           <w:bCs/>
           <w:b/>
         </w:rPr>
-        <w:t xml:space="preserve">Что описать или прислать:</w:t>
+        <w:t xml:space="preserve">Роману — о работе процесса</w:t>
       </w:r>
       <w:r>
         <w:t xml:space="preserve"> </w:t>
       </w:r>
       <w:r>
-        <w:t xml:space="preserve">интервал запуска, под каким пользователем идёт запуск, сколько длится один цикл, бывают ли пропуски или наложения; скриншот расписания и пример фактического времени запусков за последние сутки. Укажите, где это находится в вашей базе.</w:t>
-      </w:r>
-    </w:p>
-    <w:p>
-      <w:pPr>
-        <w:pStyle w:val="BodyText"/>
-      </w:pPr>
-      <w:r>
-        <w:rPr>
-          <w:bCs/>
-          <w:b/>
-        </w:rPr>
-        <w:t xml:space="preserve">Ответ:</w:t>
-      </w:r>
-    </w:p>
-    <w:p>
-      <w:pPr>
-        <w:pStyle w:val="BodyText"/>
-      </w:pPr>
-      <w:r>
-        <w:t xml:space="preserve"> </w:t>
-      </w:r>
-    </w:p>
-    <w:bookmarkEnd w:id="27"/>
-    <w:bookmarkStart w:id="28" w:name="другие-настроенные-обмены"/>
-    <w:p>
-      <w:pPr>
-        <w:pStyle w:val="Heading3"/>
-      </w:pPr>
-      <w:r>
-        <w:t xml:space="preserve">6. Другие настроенные обмены</w:t>
-      </w:r>
-    </w:p>
-    <w:p>
-      <w:pPr>
-        <w:pStyle w:val="FirstParagraph"/>
-      </w:pPr>
-      <w:r>
-        <w:rPr>
-          <w:bCs/>
-          <w:b/>
-        </w:rPr>
-        <w:t xml:space="preserve">Вопрос:</w:t>
-      </w:r>
-      <w:r>
-        <w:t xml:space="preserve"> </w:t>
-      </w:r>
-      <w:r>
-        <w:t xml:space="preserve">Какие ещё обмены и интеграции настроены в базе (банк-клиент, электронный документооборот, почта, сайт, принтер отдела ПТО, другие базы или станки, выгрузки в Excel)? Зачем: исключить конфликты новой интеграции с работающими обменами.</w:t>
-      </w:r>
-    </w:p>
-    <w:p>
-      <w:pPr>
-        <w:pStyle w:val="BodyText"/>
-      </w:pPr>
-      <w:r>
-        <w:rPr>
-          <w:bCs/>
-          <w:b/>
-        </w:rPr>
-        <w:t xml:space="preserve">Что описать или прислать:</w:t>
-      </w:r>
-      <w:r>
-        <w:t xml:space="preserve"> </w:t>
-      </w:r>
-      <w:r>
-        <w:t xml:space="preserve">перечень всех обменов; для каждого направление, способ, периодичность и ответственный. Укажите, где это находится в вашей базе.</w:t>
-      </w:r>
-    </w:p>
-    <w:p>
-      <w:pPr>
-        <w:pStyle w:val="BodyText"/>
-      </w:pPr>
-      <w:r>
-        <w:rPr>
-          <w:bCs/>
-          <w:b/>
-        </w:rPr>
-        <w:t xml:space="preserve">Ответ:</w:t>
-      </w:r>
-    </w:p>
-    <w:p>
-      <w:pPr>
-        <w:pStyle w:val="BodyText"/>
-      </w:pPr>
-      <w:r>
-        <w:t xml:space="preserve"> </w:t>
-      </w:r>
-    </w:p>
-    <w:bookmarkEnd w:id="28"/>
-    <w:bookmarkStart w:id="29" w:name="причина-ошибок-с-заказами"/>
-    <w:p>
-      <w:pPr>
-        <w:pStyle w:val="Heading3"/>
-      </w:pPr>
-      <w:r>
-        <w:t xml:space="preserve">7. Причина ошибок с заказами</w:t>
-      </w:r>
-    </w:p>
-    <w:p>
-      <w:pPr>
-        <w:pStyle w:val="FirstParagraph"/>
-      </w:pPr>
-      <w:r>
-        <w:rPr>
-          <w:bCs/>
-          <w:b/>
-        </w:rPr>
-        <w:t xml:space="preserve">Вопрос:</w:t>
-      </w:r>
-      <w:r>
-        <w:t xml:space="preserve"> </w:t>
-      </w:r>
-      <w:r>
-        <w:t xml:space="preserve">Почему у одного менеджера пропала учётная запись, его заказы оказались на Романе, а ранее распределённые заказы вернулись к нему? Зачем: понять, это откат базы, ошибка обмена или действия людей; от этого зависит, можно ли строить интеграцию на текущих данных.</w:t>
-      </w:r>
-    </w:p>
-    <w:p>
-      <w:pPr>
-        <w:pStyle w:val="BodyText"/>
-      </w:pPr>
-      <w:r>
-        <w:rPr>
-          <w:bCs/>
-          <w:b/>
-        </w:rPr>
-        <w:t xml:space="preserve">Что описать или прислать:</w:t>
-      </w:r>
-      <w:r>
-        <w:t xml:space="preserve"> </w:t>
-      </w:r>
-      <w:r>
-        <w:t xml:space="preserve">что произошло с пользователем и полем ответственного в 1С; затронуты ли ответственные в Битрикс24; записи журнала событий за период сбоя; список затронутых заказов; откатывался ли обмен. Укажите, где это находится в вашей базе.</w:t>
-      </w:r>
-    </w:p>
-    <w:p>
-      <w:pPr>
-        <w:pStyle w:val="BodyText"/>
-      </w:pPr>
-      <w:r>
-        <w:rPr>
-          <w:bCs/>
-          <w:b/>
-        </w:rPr>
-        <w:t xml:space="preserve">Ответ:</w:t>
-      </w:r>
-    </w:p>
-    <w:p>
-      <w:pPr>
-        <w:pStyle w:val="BodyText"/>
-      </w:pPr>
-      <w:r>
-        <w:t xml:space="preserve"> </w:t>
-      </w:r>
-    </w:p>
-    <w:bookmarkEnd w:id="29"/>
-    <w:bookmarkStart w:id="30" w:name="что-ещё-важно-знать"/>
-    <w:p>
-      <w:pPr>
-        <w:pStyle w:val="Heading3"/>
-      </w:pPr>
-      <w:r>
-        <w:t xml:space="preserve">8. Что ещё важно знать</w:t>
-      </w:r>
-    </w:p>
-    <w:p>
-      <w:pPr>
-        <w:pStyle w:val="FirstParagraph"/>
-      </w:pPr>
-      <w:r>
-        <w:rPr>
-          <w:bCs/>
-          <w:b/>
-        </w:rPr>
-        <w:t xml:space="preserve">Вопрос:</w:t>
-      </w:r>
-      <w:r>
-        <w:t xml:space="preserve"> </w:t>
-      </w:r>
-      <w:r>
-        <w:t xml:space="preserve">Что ещё важно знать интегратору о базе и обмене, о чём мы не спросили? Зачем: закрыть неизвестные до начала оценки, чтобы не получить дорогие изменения в ходе работ.</w:t>
-      </w:r>
-    </w:p>
-    <w:p>
-      <w:pPr>
-        <w:pStyle w:val="BodyText"/>
-      </w:pPr>
-      <w:r>
-        <w:rPr>
-          <w:bCs/>
-          <w:b/>
-        </w:rPr>
-        <w:t xml:space="preserve">Что описать или прислать:</w:t>
-      </w:r>
-      <w:r>
-        <w:t xml:space="preserve"> </w:t>
-      </w:r>
-      <w:r>
-        <w:t xml:space="preserve">известные ограничения и временные обходные решения, незакрытые ошибки, ручные операции, планы по доработкам 1С на ближайшие месяцы, зависимости от внешних сервисов; ссылки на внутреннюю документацию. Укажите, где это находится у вас.</w:t>
-      </w:r>
-    </w:p>
-    <w:p>
-      <w:pPr>
-        <w:pStyle w:val="BodyText"/>
-      </w:pPr>
-      <w:r>
-        <w:rPr>
-          <w:bCs/>
-          <w:b/>
-        </w:rPr>
-        <w:t xml:space="preserve">Ответ:</w:t>
-      </w:r>
-    </w:p>
-    <w:p>
-      <w:pPr>
-        <w:pStyle w:val="BodyText"/>
-      </w:pPr>
-      <w:r>
-        <w:t xml:space="preserve"> </w:t>
-      </w:r>
-    </w:p>
-    <w:bookmarkEnd w:id="30"/>
-    <w:bookmarkEnd w:id="31"/>
-    <w:bookmarkEnd w:id="32"/>
+        <w:t xml:space="preserve">(7 тем). Важно, чтобы понять, как люди работают в 1С на практике и что нужно получить в Битрикс24.</w:t>
+      </w:r>
+    </w:p>
+    <w:p>
+      <w:pPr>
+        <w:numPr>
+          <w:ilvl w:val="0"/>
+          <w:numId w:val="1003"/>
+        </w:numPr>
+        <w:pStyle w:val="Compact"/>
+      </w:pPr>
+      <w:r>
+        <w:t xml:space="preserve">Что произошло с заказами, которые вернулись к вам</w:t>
+      </w:r>
+    </w:p>
+    <w:p>
+      <w:pPr>
+        <w:numPr>
+          <w:ilvl w:val="0"/>
+          <w:numId w:val="1003"/>
+        </w:numPr>
+        <w:pStyle w:val="Compact"/>
+      </w:pPr>
+      <w:r>
+        <w:t xml:space="preserve">Что ещё важно знать о работе системы</w:t>
+      </w:r>
+    </w:p>
+    <w:p>
+      <w:pPr>
+        <w:numPr>
+          <w:ilvl w:val="0"/>
+          <w:numId w:val="1003"/>
+        </w:numPr>
+        <w:pStyle w:val="Compact"/>
+      </w:pPr>
+      <w:r>
+        <w:t xml:space="preserve">Сбой базы: что случилось и что восстановили</w:t>
+      </w:r>
+    </w:p>
+    <w:p>
+      <w:pPr>
+        <w:numPr>
+          <w:ilvl w:val="0"/>
+          <w:numId w:val="1003"/>
+        </w:numPr>
+        <w:pStyle w:val="Compact"/>
+      </w:pPr>
+      <w:r>
+        <w:t xml:space="preserve">Состояния заказа и как они соотносятся с этапами в Битрикс24</w:t>
+      </w:r>
+    </w:p>
+    <w:p>
+      <w:pPr>
+        <w:numPr>
+          <w:ilvl w:val="0"/>
+          <w:numId w:val="1003"/>
+        </w:numPr>
+        <w:pStyle w:val="Compact"/>
+      </w:pPr>
+      <w:r>
+        <w:t xml:space="preserve">Как часто документы правят после отправки клиенту</w:t>
+      </w:r>
+    </w:p>
+    <w:p>
+      <w:pPr>
+        <w:numPr>
+          <w:ilvl w:val="0"/>
+          <w:numId w:val="1003"/>
+        </w:numPr>
+        <w:pStyle w:val="Compact"/>
+      </w:pPr>
+      <w:r>
+        <w:t xml:space="preserve">Как сейчас принимаются и разносятся оплаты</w:t>
+      </w:r>
+    </w:p>
+    <w:p>
+      <w:pPr>
+        <w:numPr>
+          <w:ilvl w:val="0"/>
+          <w:numId w:val="1003"/>
+        </w:numPr>
+        <w:pStyle w:val="Compact"/>
+      </w:pPr>
+      <w:r>
+        <w:t xml:space="preserve">Как менеджер получает цену заказа</w:t>
+      </w:r>
+    </w:p>
+    <w:bookmarkEnd w:id="22"/>
+    <w:bookmarkEnd w:id="23"/>
     <w:sectPr/>
   </w:body>
 </w:document>
@@ -858,11 +800,156 @@
       </w:pPr>
     </w:lvl>
   </w:abstractNum>
+  <w:abstractNum w:abstractNumId="99411">
+    <w:nsid w:val="A99411"/>
+    <w:multiLevelType w:val="multilevel"/>
+    <w:lvl w:ilvl="0">
+      <w:start w:val="1"/>
+      <w:numFmt w:val="decimal"/>
+      <w:lvlText w:val="%1."/>
+      <w:lvlJc w:val="left"/>
+      <w:pPr>
+        <w:ind w:left="720" w:hanging="480"/>
+      </w:pPr>
+    </w:lvl>
+    <w:lvl w:ilvl="1">
+      <w:start w:val="1"/>
+      <w:numFmt w:val="decimal"/>
+      <w:lvlText w:val="%2."/>
+      <w:lvlJc w:val="left"/>
+      <w:pPr>
+        <w:ind w:left="1440" w:hanging="480"/>
+      </w:pPr>
+    </w:lvl>
+    <w:lvl w:ilvl="2">
+      <w:start w:val="1"/>
+      <w:numFmt w:val="decimal"/>
+      <w:lvlText w:val="%3."/>
+      <w:lvlJc w:val="left"/>
+      <w:pPr>
+        <w:ind w:left="2160" w:hanging="480"/>
+      </w:pPr>
+    </w:lvl>
+    <w:lvl w:ilvl="3">
+      <w:start w:val="1"/>
+      <w:numFmt w:val="decimal"/>
+      <w:lvlText w:val="%4."/>
+      <w:lvlJc w:val="left"/>
+      <w:pPr>
+        <w:ind w:left="2880" w:hanging="480"/>
+      </w:pPr>
+    </w:lvl>
+    <w:lvl w:ilvl="4">
+      <w:start w:val="1"/>
+      <w:numFmt w:val="decimal"/>
+      <w:lvlText w:val="%5."/>
+      <w:lvlJc w:val="left"/>
+      <w:pPr>
+        <w:ind w:left="3600" w:hanging="480"/>
+      </w:pPr>
+    </w:lvl>
+    <w:lvl w:ilvl="5">
+      <w:start w:val="1"/>
+      <w:numFmt w:val="decimal"/>
+      <w:lvlText w:val="%6."/>
+      <w:lvlJc w:val="left"/>
+      <w:pPr>
+        <w:ind w:left="4320" w:hanging="480"/>
+      </w:pPr>
+    </w:lvl>
+    <w:lvl w:ilvl="6">
+      <w:start w:val="1"/>
+      <w:numFmt w:val="decimal"/>
+      <w:lvlText w:val="%7."/>
+      <w:lvlJc w:val="left"/>
+      <w:pPr>
+        <w:ind w:left="5040" w:hanging="480"/>
+      </w:pPr>
+    </w:lvl>
+    <w:lvl w:ilvl="7">
+      <w:start w:val="1"/>
+      <w:numFmt w:val="decimal"/>
+      <w:lvlText w:val="%8."/>
+      <w:lvlJc w:val="left"/>
+      <w:pPr>
+        <w:ind w:left="5760" w:hanging="480"/>
+      </w:pPr>
+    </w:lvl>
+    <w:lvl w:ilvl="8">
+      <w:start w:val="1"/>
+      <w:numFmt w:val="decimal"/>
+      <w:lvlText w:val="%9."/>
+      <w:lvlJc w:val="left"/>
+      <w:pPr>
+        <w:ind w:left="6480" w:hanging="480"/>
+      </w:pPr>
+    </w:lvl>
+  </w:abstractNum>
   <w:num w:numId="1000">
     <w:abstractNumId w:val="990"/>
   </w:num>
   <w:num w:numId="1001">
     <w:abstractNumId w:val="991"/>
+  </w:num>
+  <w:num w:numId="1002">
+    <w:abstractNumId w:val="99411"/>
+    <w:lvlOverride w:ilvl="0">
+      <w:startOverride w:val="1"/>
+    </w:lvlOverride>
+    <w:lvlOverride w:ilvl="1">
+      <w:startOverride w:val="1"/>
+    </w:lvlOverride>
+    <w:lvlOverride w:ilvl="2">
+      <w:startOverride w:val="1"/>
+    </w:lvlOverride>
+    <w:lvlOverride w:ilvl="3">
+      <w:startOverride w:val="1"/>
+    </w:lvlOverride>
+    <w:lvlOverride w:ilvl="4">
+      <w:startOverride w:val="1"/>
+    </w:lvlOverride>
+    <w:lvlOverride w:ilvl="5">
+      <w:startOverride w:val="1"/>
+    </w:lvlOverride>
+    <w:lvlOverride w:ilvl="6">
+      <w:startOverride w:val="1"/>
+    </w:lvlOverride>
+    <w:lvlOverride w:ilvl="7">
+      <w:startOverride w:val="1"/>
+    </w:lvlOverride>
+    <w:lvlOverride w:ilvl="8">
+      <w:startOverride w:val="1"/>
+    </w:lvlOverride>
+  </w:num>
+  <w:num w:numId="1003">
+    <w:abstractNumId w:val="99411"/>
+    <w:lvlOverride w:ilvl="0">
+      <w:startOverride w:val="1"/>
+    </w:lvlOverride>
+    <w:lvlOverride w:ilvl="1">
+      <w:startOverride w:val="1"/>
+    </w:lvlOverride>
+    <w:lvlOverride w:ilvl="2">
+      <w:startOverride w:val="1"/>
+    </w:lvlOverride>
+    <w:lvlOverride w:ilvl="3">
+      <w:startOverride w:val="1"/>
+    </w:lvlOverride>
+    <w:lvlOverride w:ilvl="4">
+      <w:startOverride w:val="1"/>
+    </w:lvlOverride>
+    <w:lvlOverride w:ilvl="5">
+      <w:startOverride w:val="1"/>
+    </w:lvlOverride>
+    <w:lvlOverride w:ilvl="6">
+      <w:startOverride w:val="1"/>
+    </w:lvlOverride>
+    <w:lvlOverride w:ilvl="7">
+      <w:startOverride w:val="1"/>
+    </w:lvlOverride>
+    <w:lvlOverride w:ilvl="8">
+      <w:startOverride w:val="1"/>
+    </w:lvlOverride>
   </w:num>
 </w:numbering>
 </file>

</xml_diff>

<commit_message>
eurosteklo-y3w: TZ: Eurosteklo 1C developer question pack (atom eurosteklo-xeb, claude-7934)
ТЗ: /root/workspaces/projects/clients/eurosteklo/.worktrees/claude/eurosteklo-y3w/docs/tz/2026-10-15-1c-questions.md#U6
Atom: eurosteklo-y3w
Agent: claude
</commit_message>
<xml_diff>
--- a/docs/meetings/2026-10-15-1c-call/1c-rabochiy-list-dmitriy.docx
+++ b/docs/meetings/2026-10-15-1c-call/1c-rabochiy-list-dmitriy.docx
@@ -319,7 +319,7 @@
         <w:t xml:space="preserve"> </w:t>
       </w:r>
       <w:r>
-        <w:t xml:space="preserve">(16 тем). Важно, чтобы понять, как база устроена технически и как работает уже существующий обмен с Битрикс24.</w:t>
+        <w:t xml:space="preserve">(18 тем). Важно, чтобы понять, как база устроена технически и как работает уже существующий обмен с Битрикс24.</w:t>
       </w:r>
     </w:p>
     <w:p>
@@ -512,6 +512,30 @@
       </w:pPr>
       <w:r>
         <w:t xml:space="preserve">Тестовая копия базы и доступ для ARWOX</w:t>
+      </w:r>
+    </w:p>
+    <w:p>
+      <w:pPr>
+        <w:numPr>
+          <w:ilvl w:val="0"/>
+          <w:numId w:val="1002"/>
+        </w:numPr>
+        <w:pStyle w:val="Compact"/>
+      </w:pPr>
+      <w:r>
+        <w:t xml:space="preserve">Как в 1С настроен расчёт цены</w:t>
+      </w:r>
+    </w:p>
+    <w:p>
+      <w:pPr>
+        <w:numPr>
+          <w:ilvl w:val="0"/>
+          <w:numId w:val="1002"/>
+        </w:numPr>
+        <w:pStyle w:val="Compact"/>
+      </w:pPr>
+      <w:r>
+        <w:t xml:space="preserve">Как в 1С разносятся оплаты по заказам</w:t>
       </w:r>
     </w:p>
     <w:p>

</xml_diff>